<commit_message>
build(publish): refresh validated BIOL-1 materials and dated handoffs
</commit_message>
<xml_diff>
--- a/ALL_FILES/module-01-study-of-life-practice-quiz.docx
+++ b/ALL_FILES/module-01-study-of-life-practice-quiz.docx
@@ -24,9 +24,6 @@
       </w:r>
       <w:r>
         <w:t>A student sees frost crystals slowly "grow" on a cold window overnight. Why don't biologists count this as life?</w:t>
-      </w:r>
-      <w:r>
-        <w:br/>
       </w:r>
       <w:r>
         <w:br/>
@@ -104,9 +101,6 @@
         <w:br/>
       </w:r>
       <w:r>
-        <w:br/>
-      </w:r>
-      <w:r>
         <w:t>A. hypothesis being tested</w:t>
       </w:r>
     </w:p>
@@ -179,9 +173,6 @@
         <w:br/>
       </w:r>
       <w:r>
-        <w:br/>
-      </w:r>
-      <w:r>
         <w:t>A. Ecosystem, organism, cell</w:t>
       </w:r>
     </w:p>
@@ -249,9 +240,6 @@
       </w:r>
       <w:r>
         <w:t>A hypothesis survives many careful tests over many years. What should happen to it?</w:t>
-      </w:r>
-      <w:r>
-        <w:br/>
       </w:r>
       <w:r>
         <w:br/>

</xml_diff>